<commit_message>
Add regulation blending quiz coverage
</commit_message>
<xml_diff>
--- a/08 Printable Study Materials/Build Artifacts/Water-Operator-Vault-Flashcards-Packet.docx
+++ b/08 Printable Study Materials/Build Artifacts/Water-Operator-Vault-Flashcards-Packet.docx
@@ -21411,31 +21411,32 @@
                 <w:b/>
                 <w:sz w:val="16"/>
               </w:rPr>
-              <w:t>FRONT |  | Card 0</w:t>
-            </w:r>
-          </w:p>
-          <w:p>
-            <w:pPr>
-              <w:spacing w:before="0" w:after="0" w:line="240" w:lineRule="auto"/>
-              <w:jc w:val="center"/>
-            </w:pPr>
-            <w:r>
-              <w:rPr>
-                <w:b w:val="0"/>
-                <w:sz w:val="16"/>
-              </w:rPr>
-            </w:r>
-          </w:p>
-          <w:p>
-            <w:pPr>
-              <w:spacing w:before="0" w:after="0" w:line="240" w:lineRule="auto"/>
-              <w:jc w:val="center"/>
-            </w:pPr>
-            <w:r>
-              <w:rPr>
-                <w:b w:val="0"/>
-                <w:sz w:val="16"/>
-              </w:rPr>
+              <w:t>FRONT | T5 Flash Cards - Regulation Sources and Blending | Card 1</w:t>
+            </w:r>
+          </w:p>
+          <w:p>
+            <w:pPr>
+              <w:spacing w:before="0" w:after="0" w:line="240" w:lineRule="auto"/>
+              <w:jc w:val="center"/>
+            </w:pPr>
+            <w:r>
+              <w:rPr>
+                <w:b w:val="0"/>
+                <w:sz w:val="16"/>
+              </w:rPr>
+            </w:r>
+          </w:p>
+          <w:p>
+            <w:pPr>
+              <w:spacing w:before="0" w:after="0" w:line="240" w:lineRule="auto"/>
+              <w:jc w:val="center"/>
+            </w:pPr>
+            <w:r>
+              <w:rPr>
+                <w:b w:val="0"/>
+                <w:sz w:val="16"/>
+              </w:rPr>
+              <w:t>What is the main federal drinking-water law for public water systems?</w:t>
             </w:r>
           </w:p>
         </w:tc>
@@ -21467,31 +21468,32 @@
                 <w:b/>
                 <w:sz w:val="16"/>
               </w:rPr>
-              <w:t>FRONT |  | Card 0</w:t>
-            </w:r>
-          </w:p>
-          <w:p>
-            <w:pPr>
-              <w:spacing w:before="0" w:after="0" w:line="240" w:lineRule="auto"/>
-              <w:jc w:val="center"/>
-            </w:pPr>
-            <w:r>
-              <w:rPr>
-                <w:b w:val="0"/>
-                <w:sz w:val="16"/>
-              </w:rPr>
-            </w:r>
-          </w:p>
-          <w:p>
-            <w:pPr>
-              <w:spacing w:before="0" w:after="0" w:line="240" w:lineRule="auto"/>
-              <w:jc w:val="center"/>
-            </w:pPr>
-            <w:r>
-              <w:rPr>
-                <w:b w:val="0"/>
-                <w:sz w:val="16"/>
-              </w:rPr>
+              <w:t>FRONT | T5 Flash Cards - Regulation Sources and Blending | Card 2</w:t>
+            </w:r>
+          </w:p>
+          <w:p>
+            <w:pPr>
+              <w:spacing w:before="0" w:after="0" w:line="240" w:lineRule="auto"/>
+              <w:jc w:val="center"/>
+            </w:pPr>
+            <w:r>
+              <w:rPr>
+                <w:b w:val="0"/>
+                <w:sz w:val="16"/>
+              </w:rPr>
+            </w:r>
+          </w:p>
+          <w:p>
+            <w:pPr>
+              <w:spacing w:before="0" w:after="0" w:line="240" w:lineRule="auto"/>
+              <w:jc w:val="center"/>
+            </w:pPr>
+            <w:r>
+              <w:rPr>
+                <w:b w:val="0"/>
+                <w:sz w:val="16"/>
+              </w:rPr>
+              <w:t>Which federal regulation part contains National Primary Drinking Water Regulations?</w:t>
             </w:r>
           </w:p>
         </w:tc>
@@ -21518,31 +21520,32 @@
                 <w:b/>
                 <w:sz w:val="16"/>
               </w:rPr>
-              <w:t>FRONT |  | Card 0</w:t>
-            </w:r>
-          </w:p>
-          <w:p>
-            <w:pPr>
-              <w:spacing w:before="0" w:after="0" w:line="240" w:lineRule="auto"/>
-              <w:jc w:val="center"/>
-            </w:pPr>
-            <w:r>
-              <w:rPr>
-                <w:b w:val="0"/>
-                <w:sz w:val="16"/>
-              </w:rPr>
-            </w:r>
-          </w:p>
-          <w:p>
-            <w:pPr>
-              <w:spacing w:before="0" w:after="0" w:line="240" w:lineRule="auto"/>
-              <w:jc w:val="center"/>
-            </w:pPr>
-            <w:r>
-              <w:rPr>
-                <w:b w:val="0"/>
-                <w:sz w:val="16"/>
-              </w:rPr>
+              <w:t>FRONT | T5 Flash Cards - Regulation Sources and Blending | Card 3</w:t>
+            </w:r>
+          </w:p>
+          <w:p>
+            <w:pPr>
+              <w:spacing w:before="0" w:after="0" w:line="240" w:lineRule="auto"/>
+              <w:jc w:val="center"/>
+            </w:pPr>
+            <w:r>
+              <w:rPr>
+                <w:b w:val="0"/>
+                <w:sz w:val="16"/>
+              </w:rPr>
+            </w:r>
+          </w:p>
+          <w:p>
+            <w:pPr>
+              <w:spacing w:before="0" w:after="0" w:line="240" w:lineRule="auto"/>
+              <w:jc w:val="center"/>
+            </w:pPr>
+            <w:r>
+              <w:rPr>
+                <w:b w:val="0"/>
+                <w:sz w:val="16"/>
+              </w:rPr>
+              <w:t>Which federal regulation part is associated with state primacy and implementation?</w:t>
             </w:r>
           </w:p>
         </w:tc>
@@ -21574,31 +21577,32 @@
                 <w:b/>
                 <w:sz w:val="16"/>
               </w:rPr>
-              <w:t>FRONT |  | Card 0</w:t>
-            </w:r>
-          </w:p>
-          <w:p>
-            <w:pPr>
-              <w:spacing w:before="0" w:after="0" w:line="240" w:lineRule="auto"/>
-              <w:jc w:val="center"/>
-            </w:pPr>
-            <w:r>
-              <w:rPr>
-                <w:b w:val="0"/>
-                <w:sz w:val="16"/>
-              </w:rPr>
-            </w:r>
-          </w:p>
-          <w:p>
-            <w:pPr>
-              <w:spacing w:before="0" w:after="0" w:line="240" w:lineRule="auto"/>
-              <w:jc w:val="center"/>
-            </w:pPr>
-            <w:r>
-              <w:rPr>
-                <w:b w:val="0"/>
-                <w:sz w:val="16"/>
-              </w:rPr>
+              <w:t>FRONT | T5 Flash Cards - Regulation Sources and Blending | Card 4</w:t>
+            </w:r>
+          </w:p>
+          <w:p>
+            <w:pPr>
+              <w:spacing w:before="0" w:after="0" w:line="240" w:lineRule="auto"/>
+              <w:jc w:val="center"/>
+            </w:pPr>
+            <w:r>
+              <w:rPr>
+                <w:b w:val="0"/>
+                <w:sz w:val="16"/>
+              </w:rPr>
+            </w:r>
+          </w:p>
+          <w:p>
+            <w:pPr>
+              <w:spacing w:before="0" w:after="0" w:line="240" w:lineRule="auto"/>
+              <w:jc w:val="center"/>
+            </w:pPr>
+            <w:r>
+              <w:rPr>
+                <w:b w:val="0"/>
+                <w:sz w:val="16"/>
+              </w:rPr>
+              <w:t>Which federal regulation part contains National Secondary Drinking Water Regulations?</w:t>
             </w:r>
           </w:p>
         </w:tc>
@@ -21625,31 +21629,32 @@
                 <w:b/>
                 <w:sz w:val="16"/>
               </w:rPr>
-              <w:t>FRONT |  | Card 0</w:t>
-            </w:r>
-          </w:p>
-          <w:p>
-            <w:pPr>
-              <w:spacing w:before="0" w:after="0" w:line="240" w:lineRule="auto"/>
-              <w:jc w:val="center"/>
-            </w:pPr>
-            <w:r>
-              <w:rPr>
-                <w:b w:val="0"/>
-                <w:sz w:val="16"/>
-              </w:rPr>
-            </w:r>
-          </w:p>
-          <w:p>
-            <w:pPr>
-              <w:spacing w:before="0" w:after="0" w:line="240" w:lineRule="auto"/>
-              <w:jc w:val="center"/>
-            </w:pPr>
-            <w:r>
-              <w:rPr>
-                <w:b w:val="0"/>
-                <w:sz w:val="16"/>
-              </w:rPr>
+              <w:t>FRONT | T5 Flash Cards - Regulation Sources and Blending | Card 5</w:t>
+            </w:r>
+          </w:p>
+          <w:p>
+            <w:pPr>
+              <w:spacing w:before="0" w:after="0" w:line="240" w:lineRule="auto"/>
+              <w:jc w:val="center"/>
+            </w:pPr>
+            <w:r>
+              <w:rPr>
+                <w:b w:val="0"/>
+                <w:sz w:val="16"/>
+              </w:rPr>
+            </w:r>
+          </w:p>
+          <w:p>
+            <w:pPr>
+              <w:spacing w:before="0" w:after="0" w:line="240" w:lineRule="auto"/>
+              <w:jc w:val="center"/>
+            </w:pPr>
+            <w:r>
+              <w:rPr>
+                <w:b w:val="0"/>
+                <w:sz w:val="16"/>
+              </w:rPr>
+              <w:t>Where are California drinking-water MCLs and monitoring requirements mainly found?</w:t>
             </w:r>
           </w:p>
         </w:tc>
@@ -21833,44 +21838,45 @@
                 <w:b/>
                 <w:sz w:val="16"/>
               </w:rPr>
-              <w:t>BACK | Card 0</w:t>
-            </w:r>
-          </w:p>
-          <w:p>
-            <w:pPr>
-              <w:spacing w:before="0" w:after="0" w:line="240" w:lineRule="auto"/>
-              <w:jc w:val="center"/>
-            </w:pPr>
-            <w:r>
-              <w:rPr>
-                <w:b w:val="0"/>
-                <w:sz w:val="16"/>
-              </w:rPr>
-            </w:r>
-          </w:p>
-          <w:p>
-            <w:pPr>
-              <w:spacing w:before="0" w:after="0" w:line="240" w:lineRule="auto"/>
-              <w:jc w:val="center"/>
-            </w:pPr>
-            <w:r>
-              <w:rPr>
-                <w:b w:val="0"/>
-                <w:sz w:val="16"/>
-              </w:rPr>
-            </w:r>
-          </w:p>
-          <w:p>
-            <w:pPr>
-              <w:spacing w:before="0" w:after="0" w:line="240" w:lineRule="auto"/>
-              <w:jc w:val="center"/>
-            </w:pPr>
-            <w:r>
-              <w:rPr>
-                <w:b w:val="0"/>
-                <w:sz w:val="16"/>
-              </w:rPr>
-              <w:t xml:space="preserve">Source: </w:t>
+              <w:t>BACK | Card 1</w:t>
+            </w:r>
+          </w:p>
+          <w:p>
+            <w:pPr>
+              <w:spacing w:before="0" w:after="0" w:line="240" w:lineRule="auto"/>
+              <w:jc w:val="center"/>
+            </w:pPr>
+            <w:r>
+              <w:rPr>
+                <w:b w:val="0"/>
+                <w:sz w:val="16"/>
+              </w:rPr>
+              <w:t>Safe Drinking Water Act (SDWA).</w:t>
+            </w:r>
+          </w:p>
+          <w:p>
+            <w:pPr>
+              <w:spacing w:before="0" w:after="0" w:line="240" w:lineRule="auto"/>
+              <w:jc w:val="center"/>
+            </w:pPr>
+            <w:r>
+              <w:rPr>
+                <w:b w:val="0"/>
+                <w:sz w:val="16"/>
+              </w:rPr>
+            </w:r>
+          </w:p>
+          <w:p>
+            <w:pPr>
+              <w:spacing w:before="0" w:after="0" w:line="240" w:lineRule="auto"/>
+              <w:jc w:val="center"/>
+            </w:pPr>
+            <w:r>
+              <w:rPr>
+                <w:b w:val="0"/>
+                <w:sz w:val="16"/>
+              </w:rPr>
+              <w:t>Source: EPA-SDWA.</w:t>
             </w:r>
           </w:p>
         </w:tc>
@@ -21967,44 +21973,45 @@
                 <w:b/>
                 <w:sz w:val="16"/>
               </w:rPr>
-              <w:t>BACK | Card 0</w:t>
-            </w:r>
-          </w:p>
-          <w:p>
-            <w:pPr>
-              <w:spacing w:before="0" w:after="0" w:line="240" w:lineRule="auto"/>
-              <w:jc w:val="center"/>
-            </w:pPr>
-            <w:r>
-              <w:rPr>
-                <w:b w:val="0"/>
-                <w:sz w:val="16"/>
-              </w:rPr>
-            </w:r>
-          </w:p>
-          <w:p>
-            <w:pPr>
-              <w:spacing w:before="0" w:after="0" w:line="240" w:lineRule="auto"/>
-              <w:jc w:val="center"/>
-            </w:pPr>
-            <w:r>
-              <w:rPr>
-                <w:b w:val="0"/>
-                <w:sz w:val="16"/>
-              </w:rPr>
-            </w:r>
-          </w:p>
-          <w:p>
-            <w:pPr>
-              <w:spacing w:before="0" w:after="0" w:line="240" w:lineRule="auto"/>
-              <w:jc w:val="center"/>
-            </w:pPr>
-            <w:r>
-              <w:rPr>
-                <w:b w:val="0"/>
-                <w:sz w:val="16"/>
-              </w:rPr>
-              <w:t xml:space="preserve">Source: </w:t>
+              <w:t>BACK | Card 3</w:t>
+            </w:r>
+          </w:p>
+          <w:p>
+            <w:pPr>
+              <w:spacing w:before="0" w:after="0" w:line="240" w:lineRule="auto"/>
+              <w:jc w:val="center"/>
+            </w:pPr>
+            <w:r>
+              <w:rPr>
+                <w:b w:val="0"/>
+                <w:sz w:val="16"/>
+              </w:rPr>
+              <w:t>40 CFR Part 142.</w:t>
+            </w:r>
+          </w:p>
+          <w:p>
+            <w:pPr>
+              <w:spacing w:before="0" w:after="0" w:line="240" w:lineRule="auto"/>
+              <w:jc w:val="center"/>
+            </w:pPr>
+            <w:r>
+              <w:rPr>
+                <w:b w:val="0"/>
+                <w:sz w:val="16"/>
+              </w:rPr>
+            </w:r>
+          </w:p>
+          <w:p>
+            <w:pPr>
+              <w:spacing w:before="0" w:after="0" w:line="240" w:lineRule="auto"/>
+              <w:jc w:val="center"/>
+            </w:pPr>
+            <w:r>
+              <w:rPr>
+                <w:b w:val="0"/>
+                <w:sz w:val="16"/>
+              </w:rPr>
+              <w:t>Source: ECFR-40-CFR-142. Review flag: verify section-level details before final release.</w:t>
             </w:r>
           </w:p>
         </w:tc>
@@ -22031,44 +22038,45 @@
                 <w:b/>
                 <w:sz w:val="16"/>
               </w:rPr>
-              <w:t>BACK | Card 0</w:t>
-            </w:r>
-          </w:p>
-          <w:p>
-            <w:pPr>
-              <w:spacing w:before="0" w:after="0" w:line="240" w:lineRule="auto"/>
-              <w:jc w:val="center"/>
-            </w:pPr>
-            <w:r>
-              <w:rPr>
-                <w:b w:val="0"/>
-                <w:sz w:val="16"/>
-              </w:rPr>
-            </w:r>
-          </w:p>
-          <w:p>
-            <w:pPr>
-              <w:spacing w:before="0" w:after="0" w:line="240" w:lineRule="auto"/>
-              <w:jc w:val="center"/>
-            </w:pPr>
-            <w:r>
-              <w:rPr>
-                <w:b w:val="0"/>
-                <w:sz w:val="16"/>
-              </w:rPr>
-            </w:r>
-          </w:p>
-          <w:p>
-            <w:pPr>
-              <w:spacing w:before="0" w:after="0" w:line="240" w:lineRule="auto"/>
-              <w:jc w:val="center"/>
-            </w:pPr>
-            <w:r>
-              <w:rPr>
-                <w:b w:val="0"/>
-                <w:sz w:val="16"/>
-              </w:rPr>
-              <w:t xml:space="preserve">Source: </w:t>
+              <w:t>BACK | Card 2</w:t>
+            </w:r>
+          </w:p>
+          <w:p>
+            <w:pPr>
+              <w:spacing w:before="0" w:after="0" w:line="240" w:lineRule="auto"/>
+              <w:jc w:val="center"/>
+            </w:pPr>
+            <w:r>
+              <w:rPr>
+                <w:b w:val="0"/>
+                <w:sz w:val="16"/>
+              </w:rPr>
+              <w:t>40 CFR Part 141.</w:t>
+            </w:r>
+          </w:p>
+          <w:p>
+            <w:pPr>
+              <w:spacing w:before="0" w:after="0" w:line="240" w:lineRule="auto"/>
+              <w:jc w:val="center"/>
+            </w:pPr>
+            <w:r>
+              <w:rPr>
+                <w:b w:val="0"/>
+                <w:sz w:val="16"/>
+              </w:rPr>
+            </w:r>
+          </w:p>
+          <w:p>
+            <w:pPr>
+              <w:spacing w:before="0" w:after="0" w:line="240" w:lineRule="auto"/>
+              <w:jc w:val="center"/>
+            </w:pPr>
+            <w:r>
+              <w:rPr>
+                <w:b w:val="0"/>
+                <w:sz w:val="16"/>
+              </w:rPr>
+              <w:t>Source: ECFR-40-CFR-141.</w:t>
             </w:r>
           </w:p>
         </w:tc>
@@ -22100,44 +22108,45 @@
                 <w:b/>
                 <w:sz w:val="16"/>
               </w:rPr>
-              <w:t>BACK | Card 0</w:t>
-            </w:r>
-          </w:p>
-          <w:p>
-            <w:pPr>
-              <w:spacing w:before="0" w:after="0" w:line="240" w:lineRule="auto"/>
-              <w:jc w:val="center"/>
-            </w:pPr>
-            <w:r>
-              <w:rPr>
-                <w:b w:val="0"/>
-                <w:sz w:val="16"/>
-              </w:rPr>
-            </w:r>
-          </w:p>
-          <w:p>
-            <w:pPr>
-              <w:spacing w:before="0" w:after="0" w:line="240" w:lineRule="auto"/>
-              <w:jc w:val="center"/>
-            </w:pPr>
-            <w:r>
-              <w:rPr>
-                <w:b w:val="0"/>
-                <w:sz w:val="16"/>
-              </w:rPr>
-            </w:r>
-          </w:p>
-          <w:p>
-            <w:pPr>
-              <w:spacing w:before="0" w:after="0" w:line="240" w:lineRule="auto"/>
-              <w:jc w:val="center"/>
-            </w:pPr>
-            <w:r>
-              <w:rPr>
-                <w:b w:val="0"/>
-                <w:sz w:val="16"/>
-              </w:rPr>
-              <w:t xml:space="preserve">Source: </w:t>
+              <w:t>BACK | Card 5</w:t>
+            </w:r>
+          </w:p>
+          <w:p>
+            <w:pPr>
+              <w:spacing w:before="0" w:after="0" w:line="240" w:lineRule="auto"/>
+              <w:jc w:val="center"/>
+            </w:pPr>
+            <w:r>
+              <w:rPr>
+                <w:b w:val="0"/>
+                <w:sz w:val="16"/>
+              </w:rPr>
+              <w:t>CCR Title 22.</w:t>
+            </w:r>
+          </w:p>
+          <w:p>
+            <w:pPr>
+              <w:spacing w:before="0" w:after="0" w:line="240" w:lineRule="auto"/>
+              <w:jc w:val="center"/>
+            </w:pPr>
+            <w:r>
+              <w:rPr>
+                <w:b w:val="0"/>
+                <w:sz w:val="16"/>
+              </w:rPr>
+            </w:r>
+          </w:p>
+          <w:p>
+            <w:pPr>
+              <w:spacing w:before="0" w:after="0" w:line="240" w:lineRule="auto"/>
+              <w:jc w:val="center"/>
+            </w:pPr>
+            <w:r>
+              <w:rPr>
+                <w:b w:val="0"/>
+                <w:sz w:val="16"/>
+              </w:rPr>
+              <w:t>Source: CA-LAWBOOK / CA-TITLE-22. Review flag: section-level Title 22 audit still needed.</w:t>
             </w:r>
           </w:p>
         </w:tc>
@@ -22164,6 +22173,1960 @@
                 <w:b/>
                 <w:sz w:val="16"/>
               </w:rPr>
+              <w:t>BACK | Card 4</w:t>
+            </w:r>
+          </w:p>
+          <w:p>
+            <w:pPr>
+              <w:spacing w:before="0" w:after="0" w:line="240" w:lineRule="auto"/>
+              <w:jc w:val="center"/>
+            </w:pPr>
+            <w:r>
+              <w:rPr>
+                <w:b w:val="0"/>
+                <w:sz w:val="16"/>
+              </w:rPr>
+              <w:t>40 CFR Part 143.</w:t>
+            </w:r>
+          </w:p>
+          <w:p>
+            <w:pPr>
+              <w:spacing w:before="0" w:after="0" w:line="240" w:lineRule="auto"/>
+              <w:jc w:val="center"/>
+            </w:pPr>
+            <w:r>
+              <w:rPr>
+                <w:b w:val="0"/>
+                <w:sz w:val="16"/>
+              </w:rPr>
+            </w:r>
+          </w:p>
+          <w:p>
+            <w:pPr>
+              <w:spacing w:before="0" w:after="0" w:line="240" w:lineRule="auto"/>
+              <w:jc w:val="center"/>
+            </w:pPr>
+            <w:r>
+              <w:rPr>
+                <w:b w:val="0"/>
+                <w:sz w:val="16"/>
+              </w:rPr>
+              <w:t>Source: ECFR-40-CFR-143. Review flag: verify section-level details before final release.</w:t>
+            </w:r>
+          </w:p>
+        </w:tc>
+      </w:tr>
+    </w:tbl>
+    <w:p>
+      <w:r>
+        <w:br w:type="page"/>
+      </w:r>
+    </w:p>
+    <w:tbl>
+      <w:tblPr>
+        <w:tblW w:type="auto" w:w="0"/>
+        <w:jc w:val="center"/>
+        <w:tblLayout w:type="fixed"/>
+        <w:tblLook w:firstColumn="1" w:firstRow="1" w:lastColumn="0" w:lastRow="0" w:noHBand="0" w:noVBand="1" w:val="04A0"/>
+      </w:tblPr>
+      <w:tblGrid>
+        <w:gridCol w:w="7560"/>
+        <w:gridCol w:w="7560"/>
+      </w:tblGrid>
+      <w:tr>
+        <w:trPr>
+          <w:trHeight w:val="2520" w:hRule="exact"/>
+        </w:trPr>
+        <w:tc>
+          <w:tcPr>
+            <w:tcW w:type="dxa" w:w="7488"/>
+            <w:tcBorders>
+              <w:top w:val="single" w:sz="6" w:space="0" w:color="999999"/>
+              <w:left w:val="single" w:sz="6" w:space="0" w:color="999999"/>
+              <w:bottom w:val="single" w:sz="6" w:space="0" w:color="999999"/>
+              <w:right w:val="single" w:sz="6" w:space="0" w:color="999999"/>
+            </w:tcBorders>
+            <w:shd w:fill="FFFFFF"/>
+            <w:vAlign w:val="center"/>
+          </w:tcPr>
+          <w:p>
+            <w:pPr>
+              <w:spacing w:before="0" w:after="0" w:line="240" w:lineRule="auto"/>
+              <w:jc w:val="center"/>
+            </w:pPr>
+            <w:r/>
+            <w:r>
+              <w:rPr>
+                <w:b/>
+                <w:sz w:val="16"/>
+              </w:rPr>
+              <w:t>FRONT | T5 Flash Cards - Regulation Sources and Blending | Card 6</w:t>
+            </w:r>
+          </w:p>
+          <w:p>
+            <w:pPr>
+              <w:spacing w:before="0" w:after="0" w:line="240" w:lineRule="auto"/>
+              <w:jc w:val="center"/>
+            </w:pPr>
+            <w:r>
+              <w:rPr>
+                <w:b w:val="0"/>
+                <w:sz w:val="16"/>
+              </w:rPr>
+            </w:r>
+          </w:p>
+          <w:p>
+            <w:pPr>
+              <w:spacing w:before="0" w:after="0" w:line="240" w:lineRule="auto"/>
+              <w:jc w:val="center"/>
+            </w:pPr>
+            <w:r>
+              <w:rPr>
+                <w:b w:val="0"/>
+                <w:sz w:val="16"/>
+              </w:rPr>
+              <w:t>What is the current California source for cross-connection control program requirements?</w:t>
+            </w:r>
+          </w:p>
+        </w:tc>
+        <w:tc>
+          <w:tcPr>
+            <w:tcW w:type="dxa" w:w="7488"/>
+            <w:tcBorders>
+              <w:top w:val="single" w:sz="6" w:space="0" w:color="999999"/>
+              <w:left w:val="single" w:sz="6" w:space="0" w:color="999999"/>
+              <w:bottom w:val="single" w:sz="6" w:space="0" w:color="999999"/>
+              <w:right w:val="single" w:sz="6" w:space="0" w:color="999999"/>
+            </w:tcBorders>
+            <w:shd w:fill="FFFFFF"/>
+            <w:vAlign w:val="center"/>
+          </w:tcPr>
+          <w:p>
+            <w:pPr>
+              <w:spacing w:before="0" w:after="0" w:line="240" w:lineRule="auto"/>
+              <w:jc w:val="center"/>
+            </w:pPr>
+            <w:r/>
+            <w:r>
+              <w:rPr>
+                <w:b/>
+                <w:sz w:val="16"/>
+              </w:rPr>
+              <w:t>FRONT | T5 Flash Cards - Regulation Sources and Blending | Card 7</w:t>
+            </w:r>
+          </w:p>
+          <w:p>
+            <w:pPr>
+              <w:spacing w:before="0" w:after="0" w:line="240" w:lineRule="auto"/>
+              <w:jc w:val="center"/>
+            </w:pPr>
+            <w:r>
+              <w:rPr>
+                <w:b w:val="0"/>
+                <w:sz w:val="16"/>
+              </w:rPr>
+            </w:r>
+          </w:p>
+          <w:p>
+            <w:pPr>
+              <w:spacing w:before="0" w:after="0" w:line="240" w:lineRule="auto"/>
+              <w:jc w:val="center"/>
+            </w:pPr>
+            <w:r>
+              <w:rPr>
+                <w:b w:val="0"/>
+                <w:sz w:val="16"/>
+              </w:rPr>
+              <w:t>What rule family covers total coliform, E. coli findings, assessments, and corrective action?</w:t>
+            </w:r>
+          </w:p>
+        </w:tc>
+      </w:tr>
+      <w:tr>
+        <w:trPr>
+          <w:trHeight w:val="2520" w:hRule="exact"/>
+        </w:trPr>
+        <w:tc>
+          <w:tcPr>
+            <w:tcW w:type="dxa" w:w="7488"/>
+            <w:tcBorders>
+              <w:top w:val="single" w:sz="6" w:space="0" w:color="999999"/>
+              <w:left w:val="single" w:sz="6" w:space="0" w:color="999999"/>
+              <w:bottom w:val="single" w:sz="6" w:space="0" w:color="999999"/>
+              <w:right w:val="single" w:sz="6" w:space="0" w:color="999999"/>
+            </w:tcBorders>
+            <w:shd w:fill="FFFFFF"/>
+            <w:vAlign w:val="center"/>
+          </w:tcPr>
+          <w:p>
+            <w:pPr>
+              <w:spacing w:before="0" w:after="0" w:line="240" w:lineRule="auto"/>
+              <w:jc w:val="center"/>
+            </w:pPr>
+            <w:r/>
+            <w:r>
+              <w:rPr>
+                <w:b/>
+                <w:sz w:val="16"/>
+              </w:rPr>
+              <w:t>FRONT | T5 Flash Cards - Regulation Sources and Blending | Card 8</w:t>
+            </w:r>
+          </w:p>
+          <w:p>
+            <w:pPr>
+              <w:spacing w:before="0" w:after="0" w:line="240" w:lineRule="auto"/>
+              <w:jc w:val="center"/>
+            </w:pPr>
+            <w:r>
+              <w:rPr>
+                <w:b w:val="0"/>
+                <w:sz w:val="16"/>
+              </w:rPr>
+            </w:r>
+          </w:p>
+          <w:p>
+            <w:pPr>
+              <w:spacing w:before="0" w:after="0" w:line="240" w:lineRule="auto"/>
+              <w:jc w:val="center"/>
+            </w:pPr>
+            <w:r>
+              <w:rPr>
+                <w:b w:val="0"/>
+                <w:sz w:val="16"/>
+              </w:rPr>
+              <w:t>What rule family covers TTHM and HAA5?</w:t>
+            </w:r>
+          </w:p>
+        </w:tc>
+        <w:tc>
+          <w:tcPr>
+            <w:tcW w:type="dxa" w:w="7488"/>
+            <w:tcBorders>
+              <w:top w:val="single" w:sz="6" w:space="0" w:color="999999"/>
+              <w:left w:val="single" w:sz="6" w:space="0" w:color="999999"/>
+              <w:bottom w:val="single" w:sz="6" w:space="0" w:color="999999"/>
+              <w:right w:val="single" w:sz="6" w:space="0" w:color="999999"/>
+            </w:tcBorders>
+            <w:shd w:fill="FFFFFF"/>
+            <w:vAlign w:val="center"/>
+          </w:tcPr>
+          <w:p>
+            <w:pPr>
+              <w:spacing w:before="0" w:after="0" w:line="240" w:lineRule="auto"/>
+              <w:jc w:val="center"/>
+            </w:pPr>
+            <w:r/>
+            <w:r>
+              <w:rPr>
+                <w:b/>
+                <w:sz w:val="16"/>
+              </w:rPr>
+              <w:t>FRONT | T5 Flash Cards - Regulation Sources and Blending | Card 9</w:t>
+            </w:r>
+          </w:p>
+          <w:p>
+            <w:pPr>
+              <w:spacing w:before="0" w:after="0" w:line="240" w:lineRule="auto"/>
+              <w:jc w:val="center"/>
+            </w:pPr>
+            <w:r>
+              <w:rPr>
+                <w:b w:val="0"/>
+                <w:sz w:val="16"/>
+              </w:rPr>
+            </w:r>
+          </w:p>
+          <w:p>
+            <w:pPr>
+              <w:spacing w:before="0" w:after="0" w:line="240" w:lineRule="auto"/>
+              <w:jc w:val="center"/>
+            </w:pPr>
+            <w:r>
+              <w:rPr>
+                <w:b w:val="0"/>
+                <w:sz w:val="16"/>
+              </w:rPr>
+              <w:t>Which rule family covers filtration, turbidity, CT, Giardia, viruses, and Cryptosporidium?</w:t>
+            </w:r>
+          </w:p>
+        </w:tc>
+      </w:tr>
+      <w:tr>
+        <w:trPr>
+          <w:trHeight w:val="2520" w:hRule="exact"/>
+        </w:trPr>
+        <w:tc>
+          <w:tcPr>
+            <w:tcW w:type="dxa" w:w="7488"/>
+            <w:tcBorders>
+              <w:top w:val="single" w:sz="6" w:space="0" w:color="999999"/>
+              <w:left w:val="single" w:sz="6" w:space="0" w:color="999999"/>
+              <w:bottom w:val="single" w:sz="6" w:space="0" w:color="999999"/>
+              <w:right w:val="single" w:sz="6" w:space="0" w:color="999999"/>
+            </w:tcBorders>
+            <w:shd w:fill="FFFFFF"/>
+            <w:vAlign w:val="center"/>
+          </w:tcPr>
+          <w:p>
+            <w:pPr>
+              <w:spacing w:before="0" w:after="0" w:line="240" w:lineRule="auto"/>
+              <w:jc w:val="center"/>
+            </w:pPr>
+            <w:r/>
+            <w:r>
+              <w:rPr>
+                <w:b/>
+                <w:sz w:val="16"/>
+              </w:rPr>
+              <w:t>FRONT | T5 Flash Cards - Regulation Sources and Blending | Card 10</w:t>
+            </w:r>
+          </w:p>
+          <w:p>
+            <w:pPr>
+              <w:spacing w:before="0" w:after="0" w:line="240" w:lineRule="auto"/>
+              <w:jc w:val="center"/>
+            </w:pPr>
+            <w:r>
+              <w:rPr>
+                <w:b w:val="0"/>
+                <w:sz w:val="16"/>
+              </w:rPr>
+            </w:r>
+          </w:p>
+          <w:p>
+            <w:pPr>
+              <w:spacing w:before="0" w:after="0" w:line="240" w:lineRule="auto"/>
+              <w:jc w:val="center"/>
+            </w:pPr>
+            <w:r>
+              <w:rPr>
+                <w:b w:val="0"/>
+                <w:sz w:val="16"/>
+              </w:rPr>
+              <w:t>What regulatory concept is central to lead and copper compliance?</w:t>
+            </w:r>
+          </w:p>
+        </w:tc>
+        <w:tc>
+          <w:tcPr>
+            <w:tcW w:type="dxa" w:w="7488"/>
+            <w:tcBorders>
+              <w:top w:val="single" w:sz="6" w:space="0" w:color="999999"/>
+              <w:left w:val="single" w:sz="6" w:space="0" w:color="999999"/>
+              <w:bottom w:val="single" w:sz="6" w:space="0" w:color="999999"/>
+              <w:right w:val="single" w:sz="6" w:space="0" w:color="999999"/>
+            </w:tcBorders>
+            <w:shd w:fill="FFFFFF"/>
+            <w:vAlign w:val="center"/>
+          </w:tcPr>
+          <w:p>
+            <w:pPr>
+              <w:spacing w:before="0" w:after="0" w:line="240" w:lineRule="auto"/>
+              <w:jc w:val="center"/>
+            </w:pPr>
+            <w:r/>
+            <w:r>
+              <w:rPr>
+                <w:b/>
+                <w:sz w:val="16"/>
+              </w:rPr>
+              <w:t>FRONT | T5 Flash Cards - Regulation Sources and Blending | Card 11</w:t>
+            </w:r>
+          </w:p>
+          <w:p>
+            <w:pPr>
+              <w:spacing w:before="0" w:after="0" w:line="240" w:lineRule="auto"/>
+              <w:jc w:val="center"/>
+            </w:pPr>
+            <w:r>
+              <w:rPr>
+                <w:b w:val="0"/>
+                <w:sz w:val="16"/>
+              </w:rPr>
+            </w:r>
+          </w:p>
+          <w:p>
+            <w:pPr>
+              <w:spacing w:before="0" w:after="0" w:line="240" w:lineRule="auto"/>
+              <w:jc w:val="center"/>
+            </w:pPr>
+            <w:r>
+              <w:rPr>
+                <w:b w:val="0"/>
+                <w:sz w:val="16"/>
+              </w:rPr>
+              <w:t>What principle is used for source-water blending calculations?</w:t>
+            </w:r>
+          </w:p>
+        </w:tc>
+      </w:tr>
+      <w:tr>
+        <w:trPr>
+          <w:trHeight w:val="2520" w:hRule="exact"/>
+        </w:trPr>
+        <w:tc>
+          <w:tcPr>
+            <w:tcW w:type="dxa" w:w="7488"/>
+            <w:tcBorders>
+              <w:top w:val="single" w:sz="6" w:space="0" w:color="999999"/>
+              <w:left w:val="single" w:sz="6" w:space="0" w:color="999999"/>
+              <w:bottom w:val="single" w:sz="6" w:space="0" w:color="999999"/>
+              <w:right w:val="single" w:sz="6" w:space="0" w:color="999999"/>
+            </w:tcBorders>
+            <w:shd w:fill="FFFFFF"/>
+            <w:vAlign w:val="center"/>
+          </w:tcPr>
+          <w:p>
+            <w:pPr>
+              <w:spacing w:before="0" w:after="0" w:line="240" w:lineRule="auto"/>
+              <w:jc w:val="center"/>
+            </w:pPr>
+            <w:r/>
+            <w:r>
+              <w:rPr>
+                <w:b/>
+                <w:sz w:val="16"/>
+              </w:rPr>
+              <w:t>FRONT | T5 Flash Cards - Regulation Sources and Blending | Card 12</w:t>
+            </w:r>
+          </w:p>
+          <w:p>
+            <w:pPr>
+              <w:spacing w:before="0" w:after="0" w:line="240" w:lineRule="auto"/>
+              <w:jc w:val="center"/>
+            </w:pPr>
+            <w:r>
+              <w:rPr>
+                <w:b w:val="0"/>
+                <w:sz w:val="16"/>
+              </w:rPr>
+            </w:r>
+          </w:p>
+          <w:p>
+            <w:pPr>
+              <w:spacing w:before="0" w:after="0" w:line="240" w:lineRule="auto"/>
+              <w:jc w:val="center"/>
+            </w:pPr>
+            <w:r>
+              <w:rPr>
+                <w:b w:val="0"/>
+                <w:sz w:val="16"/>
+              </w:rPr>
+              <w:t>Source A is 2 MGD at 8 mg/L nitrate and Source B is 1 MGD at 2 mg/L nitrate. What is the blended nitrate?</w:t>
+            </w:r>
+          </w:p>
+        </w:tc>
+        <w:tc>
+          <w:tcPr>
+            <w:tcW w:type="dxa" w:w="7488"/>
+            <w:tcBorders>
+              <w:top w:val="single" w:sz="6" w:space="0" w:color="999999"/>
+              <w:left w:val="single" w:sz="6" w:space="0" w:color="999999"/>
+              <w:bottom w:val="single" w:sz="6" w:space="0" w:color="999999"/>
+              <w:right w:val="single" w:sz="6" w:space="0" w:color="999999"/>
+            </w:tcBorders>
+            <w:shd w:fill="FFFFFF"/>
+            <w:vAlign w:val="center"/>
+          </w:tcPr>
+          <w:p>
+            <w:pPr>
+              <w:spacing w:before="0" w:after="0" w:line="240" w:lineRule="auto"/>
+              <w:jc w:val="center"/>
+            </w:pPr>
+            <w:r/>
+            <w:r>
+              <w:rPr>
+                <w:b/>
+                <w:sz w:val="16"/>
+              </w:rPr>
+              <w:t>FRONT | T5 Flash Cards - Regulation Sources and Blending | Card 13</w:t>
+            </w:r>
+          </w:p>
+          <w:p>
+            <w:pPr>
+              <w:spacing w:before="0" w:after="0" w:line="240" w:lineRule="auto"/>
+              <w:jc w:val="center"/>
+            </w:pPr>
+            <w:r>
+              <w:rPr>
+                <w:b w:val="0"/>
+                <w:sz w:val="16"/>
+              </w:rPr>
+            </w:r>
+          </w:p>
+          <w:p>
+            <w:pPr>
+              <w:spacing w:before="0" w:after="0" w:line="240" w:lineRule="auto"/>
+              <w:jc w:val="center"/>
+            </w:pPr>
+            <w:r>
+              <w:rPr>
+                <w:b w:val="0"/>
+                <w:sz w:val="16"/>
+              </w:rPr>
+              <w:t>A 0.5 MGD source has 12 ug/L arsenic and a 1.5 MGD source has 4 ug/L arsenic. What is the blended arsenic?</w:t>
+            </w:r>
+          </w:p>
+        </w:tc>
+      </w:tr>
+    </w:tbl>
+    <w:p>
+      <w:r>
+        <w:br w:type="page"/>
+      </w:r>
+    </w:p>
+    <w:tbl>
+      <w:tblPr>
+        <w:tblW w:type="auto" w:w="0"/>
+        <w:jc w:val="center"/>
+        <w:tblLayout w:type="fixed"/>
+        <w:tblLook w:firstColumn="1" w:firstRow="1" w:lastColumn="0" w:lastRow="0" w:noHBand="0" w:noVBand="1" w:val="04A0"/>
+      </w:tblPr>
+      <w:tblGrid>
+        <w:gridCol w:w="7560"/>
+        <w:gridCol w:w="7560"/>
+      </w:tblGrid>
+      <w:tr>
+        <w:trPr>
+          <w:trHeight w:val="2520" w:hRule="exact"/>
+        </w:trPr>
+        <w:tc>
+          <w:tcPr>
+            <w:tcW w:type="dxa" w:w="7488"/>
+            <w:tcBorders>
+              <w:top w:val="single" w:sz="6" w:space="0" w:color="999999"/>
+              <w:left w:val="single" w:sz="6" w:space="0" w:color="999999"/>
+              <w:bottom w:val="single" w:sz="6" w:space="0" w:color="999999"/>
+              <w:right w:val="single" w:sz="6" w:space="0" w:color="999999"/>
+            </w:tcBorders>
+            <w:shd w:fill="FFFFFF"/>
+            <w:vAlign w:val="center"/>
+          </w:tcPr>
+          <w:p>
+            <w:pPr>
+              <w:spacing w:before="0" w:after="0" w:line="240" w:lineRule="auto"/>
+              <w:jc w:val="center"/>
+            </w:pPr>
+            <w:r/>
+            <w:r>
+              <w:rPr>
+                <w:b/>
+                <w:sz w:val="16"/>
+              </w:rPr>
+              <w:t>BACK | Card 7</w:t>
+            </w:r>
+          </w:p>
+          <w:p>
+            <w:pPr>
+              <w:spacing w:before="0" w:after="0" w:line="240" w:lineRule="auto"/>
+              <w:jc w:val="center"/>
+            </w:pPr>
+            <w:r>
+              <w:rPr>
+                <w:b w:val="0"/>
+                <w:sz w:val="16"/>
+              </w:rPr>
+              <w:t>Revised Total Coliform Rule / bacteriological monitoring framework.</w:t>
+            </w:r>
+          </w:p>
+          <w:p>
+            <w:pPr>
+              <w:spacing w:before="0" w:after="0" w:line="240" w:lineRule="auto"/>
+              <w:jc w:val="center"/>
+            </w:pPr>
+            <w:r>
+              <w:rPr>
+                <w:b w:val="0"/>
+                <w:sz w:val="16"/>
+              </w:rPr>
+            </w:r>
+          </w:p>
+          <w:p>
+            <w:pPr>
+              <w:spacing w:before="0" w:after="0" w:line="240" w:lineRule="auto"/>
+              <w:jc w:val="center"/>
+            </w:pPr>
+            <w:r>
+              <w:rPr>
+                <w:b w:val="0"/>
+                <w:sz w:val="16"/>
+              </w:rPr>
+              <w:t>Source: EPA-RTCR / Title 22 context.</w:t>
+            </w:r>
+          </w:p>
+        </w:tc>
+        <w:tc>
+          <w:tcPr>
+            <w:tcW w:type="dxa" w:w="7488"/>
+            <w:tcBorders>
+              <w:top w:val="single" w:sz="6" w:space="0" w:color="999999"/>
+              <w:left w:val="single" w:sz="6" w:space="0" w:color="999999"/>
+              <w:bottom w:val="single" w:sz="6" w:space="0" w:color="999999"/>
+              <w:right w:val="single" w:sz="6" w:space="0" w:color="999999"/>
+            </w:tcBorders>
+            <w:shd w:fill="FFFFFF"/>
+            <w:vAlign w:val="center"/>
+          </w:tcPr>
+          <w:p>
+            <w:pPr>
+              <w:spacing w:before="0" w:after="0" w:line="240" w:lineRule="auto"/>
+              <w:jc w:val="center"/>
+            </w:pPr>
+            <w:r/>
+            <w:r>
+              <w:rPr>
+                <w:b/>
+                <w:sz w:val="16"/>
+              </w:rPr>
+              <w:t>BACK | Card 6</w:t>
+            </w:r>
+          </w:p>
+          <w:p>
+            <w:pPr>
+              <w:spacing w:before="0" w:after="0" w:line="240" w:lineRule="auto"/>
+              <w:jc w:val="center"/>
+            </w:pPr>
+            <w:r>
+              <w:rPr>
+                <w:b w:val="0"/>
+                <w:sz w:val="16"/>
+              </w:rPr>
+              <w:t>Cross-Connection Control Policy Handbook (CCCPH), which replaced the old Title 17 cross-connection regulations.</w:t>
+            </w:r>
+          </w:p>
+          <w:p>
+            <w:pPr>
+              <w:spacing w:before="0" w:after="0" w:line="240" w:lineRule="auto"/>
+              <w:jc w:val="center"/>
+            </w:pPr>
+            <w:r>
+              <w:rPr>
+                <w:b w:val="0"/>
+                <w:sz w:val="16"/>
+              </w:rPr>
+            </w:r>
+          </w:p>
+          <w:p>
+            <w:pPr>
+              <w:spacing w:before="0" w:after="0" w:line="240" w:lineRule="auto"/>
+              <w:jc w:val="center"/>
+            </w:pPr>
+            <w:r>
+              <w:rPr>
+                <w:b w:val="0"/>
+                <w:sz w:val="16"/>
+              </w:rPr>
+              <w:t>Source: CA-CCCPH.</w:t>
+            </w:r>
+          </w:p>
+        </w:tc>
+      </w:tr>
+      <w:tr>
+        <w:trPr>
+          <w:trHeight w:val="2520" w:hRule="exact"/>
+        </w:trPr>
+        <w:tc>
+          <w:tcPr>
+            <w:tcW w:type="dxa" w:w="7488"/>
+            <w:tcBorders>
+              <w:top w:val="single" w:sz="6" w:space="0" w:color="999999"/>
+              <w:left w:val="single" w:sz="6" w:space="0" w:color="999999"/>
+              <w:bottom w:val="single" w:sz="6" w:space="0" w:color="999999"/>
+              <w:right w:val="single" w:sz="6" w:space="0" w:color="999999"/>
+            </w:tcBorders>
+            <w:shd w:fill="FFFFFF"/>
+            <w:vAlign w:val="center"/>
+          </w:tcPr>
+          <w:p>
+            <w:pPr>
+              <w:spacing w:before="0" w:after="0" w:line="240" w:lineRule="auto"/>
+              <w:jc w:val="center"/>
+            </w:pPr>
+            <w:r/>
+            <w:r>
+              <w:rPr>
+                <w:b/>
+                <w:sz w:val="16"/>
+              </w:rPr>
+              <w:t>BACK | Card 9</w:t>
+            </w:r>
+          </w:p>
+          <w:p>
+            <w:pPr>
+              <w:spacing w:before="0" w:after="0" w:line="240" w:lineRule="auto"/>
+              <w:jc w:val="center"/>
+            </w:pPr>
+            <w:r>
+              <w:rPr>
+                <w:b w:val="0"/>
+                <w:sz w:val="16"/>
+              </w:rPr>
+              <w:t>Surface Water Treatment Rule family.</w:t>
+            </w:r>
+          </w:p>
+          <w:p>
+            <w:pPr>
+              <w:spacing w:before="0" w:after="0" w:line="240" w:lineRule="auto"/>
+              <w:jc w:val="center"/>
+            </w:pPr>
+            <w:r>
+              <w:rPr>
+                <w:b w:val="0"/>
+                <w:sz w:val="16"/>
+              </w:rPr>
+            </w:r>
+          </w:p>
+          <w:p>
+            <w:pPr>
+              <w:spacing w:before="0" w:after="0" w:line="240" w:lineRule="auto"/>
+              <w:jc w:val="center"/>
+            </w:pPr>
+            <w:r>
+              <w:rPr>
+                <w:b w:val="0"/>
+                <w:sz w:val="16"/>
+              </w:rPr>
+              <w:t>Source: EPA-SWTR.</w:t>
+            </w:r>
+          </w:p>
+        </w:tc>
+        <w:tc>
+          <w:tcPr>
+            <w:tcW w:type="dxa" w:w="7488"/>
+            <w:tcBorders>
+              <w:top w:val="single" w:sz="6" w:space="0" w:color="999999"/>
+              <w:left w:val="single" w:sz="6" w:space="0" w:color="999999"/>
+              <w:bottom w:val="single" w:sz="6" w:space="0" w:color="999999"/>
+              <w:right w:val="single" w:sz="6" w:space="0" w:color="999999"/>
+            </w:tcBorders>
+            <w:shd w:fill="FFFFFF"/>
+            <w:vAlign w:val="center"/>
+          </w:tcPr>
+          <w:p>
+            <w:pPr>
+              <w:spacing w:before="0" w:after="0" w:line="240" w:lineRule="auto"/>
+              <w:jc w:val="center"/>
+            </w:pPr>
+            <w:r/>
+            <w:r>
+              <w:rPr>
+                <w:b/>
+                <w:sz w:val="16"/>
+              </w:rPr>
+              <w:t>BACK | Card 8</w:t>
+            </w:r>
+          </w:p>
+          <w:p>
+            <w:pPr>
+              <w:spacing w:before="0" w:after="0" w:line="240" w:lineRule="auto"/>
+              <w:jc w:val="center"/>
+            </w:pPr>
+            <w:r>
+              <w:rPr>
+                <w:b w:val="0"/>
+                <w:sz w:val="16"/>
+              </w:rPr>
+              <w:t>Stage 1 and Stage 2 Disinfectants and Disinfection Byproducts Rules.</w:t>
+            </w:r>
+          </w:p>
+          <w:p>
+            <w:pPr>
+              <w:spacing w:before="0" w:after="0" w:line="240" w:lineRule="auto"/>
+              <w:jc w:val="center"/>
+            </w:pPr>
+            <w:r>
+              <w:rPr>
+                <w:b w:val="0"/>
+                <w:sz w:val="16"/>
+              </w:rPr>
+            </w:r>
+          </w:p>
+          <w:p>
+            <w:pPr>
+              <w:spacing w:before="0" w:after="0" w:line="240" w:lineRule="auto"/>
+              <w:jc w:val="center"/>
+            </w:pPr>
+            <w:r>
+              <w:rPr>
+                <w:b w:val="0"/>
+                <w:sz w:val="16"/>
+              </w:rPr>
+              <w:t>Source: EPA-DBPR.</w:t>
+            </w:r>
+          </w:p>
+        </w:tc>
+      </w:tr>
+      <w:tr>
+        <w:trPr>
+          <w:trHeight w:val="2520" w:hRule="exact"/>
+        </w:trPr>
+        <w:tc>
+          <w:tcPr>
+            <w:tcW w:type="dxa" w:w="7488"/>
+            <w:tcBorders>
+              <w:top w:val="single" w:sz="6" w:space="0" w:color="999999"/>
+              <w:left w:val="single" w:sz="6" w:space="0" w:color="999999"/>
+              <w:bottom w:val="single" w:sz="6" w:space="0" w:color="999999"/>
+              <w:right w:val="single" w:sz="6" w:space="0" w:color="999999"/>
+            </w:tcBorders>
+            <w:shd w:fill="FFFFFF"/>
+            <w:vAlign w:val="center"/>
+          </w:tcPr>
+          <w:p>
+            <w:pPr>
+              <w:spacing w:before="0" w:after="0" w:line="240" w:lineRule="auto"/>
+              <w:jc w:val="center"/>
+            </w:pPr>
+            <w:r/>
+            <w:r>
+              <w:rPr>
+                <w:b/>
+                <w:sz w:val="16"/>
+              </w:rPr>
+              <w:t>BACK | Card 11</w:t>
+            </w:r>
+          </w:p>
+          <w:p>
+            <w:pPr>
+              <w:spacing w:before="0" w:after="0" w:line="240" w:lineRule="auto"/>
+              <w:jc w:val="center"/>
+            </w:pPr>
+            <w:r>
+              <w:rPr>
+                <w:b w:val="0"/>
+                <w:sz w:val="16"/>
+              </w:rPr>
+              <w:t>Flow-weighted concentration from each source.</w:t>
+            </w:r>
+          </w:p>
+          <w:p>
+            <w:pPr>
+              <w:spacing w:before="0" w:after="0" w:line="240" w:lineRule="auto"/>
+              <w:jc w:val="center"/>
+            </w:pPr>
+            <w:r>
+              <w:rPr>
+                <w:b w:val="0"/>
+                <w:sz w:val="16"/>
+              </w:rPr>
+            </w:r>
+          </w:p>
+          <w:p>
+            <w:pPr>
+              <w:spacing w:before="0" w:after="0" w:line="240" w:lineRule="auto"/>
+              <w:jc w:val="center"/>
+            </w:pPr>
+            <w:r>
+              <w:rPr>
+                <w:b w:val="0"/>
+                <w:sz w:val="16"/>
+              </w:rPr>
+              <w:t>Source: Deck: T5 Flash Cards - Regulation Sources and Blending</w:t>
+            </w:r>
+          </w:p>
+        </w:tc>
+        <w:tc>
+          <w:tcPr>
+            <w:tcW w:type="dxa" w:w="7488"/>
+            <w:tcBorders>
+              <w:top w:val="single" w:sz="6" w:space="0" w:color="999999"/>
+              <w:left w:val="single" w:sz="6" w:space="0" w:color="999999"/>
+              <w:bottom w:val="single" w:sz="6" w:space="0" w:color="999999"/>
+              <w:right w:val="single" w:sz="6" w:space="0" w:color="999999"/>
+            </w:tcBorders>
+            <w:shd w:fill="FFFFFF"/>
+            <w:vAlign w:val="center"/>
+          </w:tcPr>
+          <w:p>
+            <w:pPr>
+              <w:spacing w:before="0" w:after="0" w:line="240" w:lineRule="auto"/>
+              <w:jc w:val="center"/>
+            </w:pPr>
+            <w:r/>
+            <w:r>
+              <w:rPr>
+                <w:b/>
+                <w:sz w:val="16"/>
+              </w:rPr>
+              <w:t>BACK | Card 10</w:t>
+            </w:r>
+          </w:p>
+          <w:p>
+            <w:pPr>
+              <w:spacing w:before="0" w:after="0" w:line="240" w:lineRule="auto"/>
+              <w:jc w:val="center"/>
+            </w:pPr>
+            <w:r>
+              <w:rPr>
+                <w:b w:val="0"/>
+                <w:sz w:val="16"/>
+              </w:rPr>
+              <w:t>Action levels and corrosion-control framework, not a simple finished-water MCL model.</w:t>
+            </w:r>
+          </w:p>
+          <w:p>
+            <w:pPr>
+              <w:spacing w:before="0" w:after="0" w:line="240" w:lineRule="auto"/>
+              <w:jc w:val="center"/>
+            </w:pPr>
+            <w:r>
+              <w:rPr>
+                <w:b w:val="0"/>
+                <w:sz w:val="16"/>
+              </w:rPr>
+            </w:r>
+          </w:p>
+          <w:p>
+            <w:pPr>
+              <w:spacing w:before="0" w:after="0" w:line="240" w:lineRule="auto"/>
+              <w:jc w:val="center"/>
+            </w:pPr>
+            <w:r>
+              <w:rPr>
+                <w:b w:val="0"/>
+                <w:sz w:val="16"/>
+              </w:rPr>
+              <w:t>Source: EPA-LCR. Review flag: LCRI transition context can change.</w:t>
+            </w:r>
+          </w:p>
+        </w:tc>
+      </w:tr>
+      <w:tr>
+        <w:trPr>
+          <w:trHeight w:val="2520" w:hRule="exact"/>
+        </w:trPr>
+        <w:tc>
+          <w:tcPr>
+            <w:tcW w:type="dxa" w:w="7488"/>
+            <w:tcBorders>
+              <w:top w:val="single" w:sz="6" w:space="0" w:color="999999"/>
+              <w:left w:val="single" w:sz="6" w:space="0" w:color="999999"/>
+              <w:bottom w:val="single" w:sz="6" w:space="0" w:color="999999"/>
+              <w:right w:val="single" w:sz="6" w:space="0" w:color="999999"/>
+            </w:tcBorders>
+            <w:shd w:fill="FFFFFF"/>
+            <w:vAlign w:val="center"/>
+          </w:tcPr>
+          <w:p>
+            <w:pPr>
+              <w:spacing w:before="0" w:after="0" w:line="240" w:lineRule="auto"/>
+              <w:jc w:val="center"/>
+            </w:pPr>
+            <w:r/>
+            <w:r>
+              <w:rPr>
+                <w:b/>
+                <w:sz w:val="16"/>
+              </w:rPr>
+              <w:t>BACK | Card 13</w:t>
+            </w:r>
+          </w:p>
+          <w:p>
+            <w:pPr>
+              <w:spacing w:before="0" w:after="0" w:line="240" w:lineRule="auto"/>
+              <w:jc w:val="center"/>
+            </w:pPr>
+            <w:r>
+              <w:rPr>
+                <w:b w:val="0"/>
+                <w:sz w:val="16"/>
+              </w:rPr>
+              <w:t>6 ug/L. Calculation: ((0.5 x 12) + (1.5 x 4)) / 2.0 = 6.</w:t>
+            </w:r>
+          </w:p>
+          <w:p>
+            <w:pPr>
+              <w:spacing w:before="0" w:after="0" w:line="240" w:lineRule="auto"/>
+              <w:jc w:val="center"/>
+            </w:pPr>
+            <w:r>
+              <w:rPr>
+                <w:b w:val="0"/>
+                <w:sz w:val="16"/>
+              </w:rPr>
+            </w:r>
+          </w:p>
+          <w:p>
+            <w:pPr>
+              <w:spacing w:before="0" w:after="0" w:line="240" w:lineRule="auto"/>
+              <w:jc w:val="center"/>
+            </w:pPr>
+            <w:r>
+              <w:rPr>
+                <w:b w:val="0"/>
+                <w:sz w:val="16"/>
+              </w:rPr>
+              <w:t>Source: Deck: T5 Flash Cards - Regulation Sources and Blending</w:t>
+            </w:r>
+          </w:p>
+        </w:tc>
+        <w:tc>
+          <w:tcPr>
+            <w:tcW w:type="dxa" w:w="7488"/>
+            <w:tcBorders>
+              <w:top w:val="single" w:sz="6" w:space="0" w:color="999999"/>
+              <w:left w:val="single" w:sz="6" w:space="0" w:color="999999"/>
+              <w:bottom w:val="single" w:sz="6" w:space="0" w:color="999999"/>
+              <w:right w:val="single" w:sz="6" w:space="0" w:color="999999"/>
+            </w:tcBorders>
+            <w:shd w:fill="FFFFFF"/>
+            <w:vAlign w:val="center"/>
+          </w:tcPr>
+          <w:p>
+            <w:pPr>
+              <w:spacing w:before="0" w:after="0" w:line="240" w:lineRule="auto"/>
+              <w:jc w:val="center"/>
+            </w:pPr>
+            <w:r/>
+            <w:r>
+              <w:rPr>
+                <w:b/>
+                <w:sz w:val="16"/>
+              </w:rPr>
+              <w:t>BACK | Card 12</w:t>
+            </w:r>
+          </w:p>
+          <w:p>
+            <w:pPr>
+              <w:spacing w:before="0" w:after="0" w:line="240" w:lineRule="auto"/>
+              <w:jc w:val="center"/>
+            </w:pPr>
+            <w:r>
+              <w:rPr>
+                <w:b w:val="0"/>
+                <w:sz w:val="16"/>
+              </w:rPr>
+              <w:t>6 mg/L. Calculation: ((2 x 8) + (1 x 2)) / 3 = 6.</w:t>
+            </w:r>
+          </w:p>
+          <w:p>
+            <w:pPr>
+              <w:spacing w:before="0" w:after="0" w:line="240" w:lineRule="auto"/>
+              <w:jc w:val="center"/>
+            </w:pPr>
+            <w:r>
+              <w:rPr>
+                <w:b w:val="0"/>
+                <w:sz w:val="16"/>
+              </w:rPr>
+            </w:r>
+          </w:p>
+          <w:p>
+            <w:pPr>
+              <w:spacing w:before="0" w:after="0" w:line="240" w:lineRule="auto"/>
+              <w:jc w:val="center"/>
+            </w:pPr>
+            <w:r>
+              <w:rPr>
+                <w:b w:val="0"/>
+                <w:sz w:val="16"/>
+              </w:rPr>
+              <w:t>Source: Deck: T5 Flash Cards - Regulation Sources and Blending</w:t>
+            </w:r>
+          </w:p>
+        </w:tc>
+      </w:tr>
+    </w:tbl>
+    <w:p>
+      <w:r>
+        <w:br w:type="page"/>
+      </w:r>
+    </w:p>
+    <w:tbl>
+      <w:tblPr>
+        <w:tblW w:type="auto" w:w="0"/>
+        <w:jc w:val="center"/>
+        <w:tblLayout w:type="fixed"/>
+        <w:tblLook w:firstColumn="1" w:firstRow="1" w:lastColumn="0" w:lastRow="0" w:noHBand="0" w:noVBand="1" w:val="04A0"/>
+      </w:tblPr>
+      <w:tblGrid>
+        <w:gridCol w:w="7560"/>
+        <w:gridCol w:w="7560"/>
+      </w:tblGrid>
+      <w:tr>
+        <w:trPr>
+          <w:trHeight w:val="2520" w:hRule="exact"/>
+        </w:trPr>
+        <w:tc>
+          <w:tcPr>
+            <w:tcW w:type="dxa" w:w="7488"/>
+            <w:tcBorders>
+              <w:top w:val="single" w:sz="6" w:space="0" w:color="999999"/>
+              <w:left w:val="single" w:sz="6" w:space="0" w:color="999999"/>
+              <w:bottom w:val="single" w:sz="6" w:space="0" w:color="999999"/>
+              <w:right w:val="single" w:sz="6" w:space="0" w:color="999999"/>
+            </w:tcBorders>
+            <w:shd w:fill="FFFFFF"/>
+            <w:vAlign w:val="center"/>
+          </w:tcPr>
+          <w:p>
+            <w:pPr>
+              <w:spacing w:before="0" w:after="0" w:line="240" w:lineRule="auto"/>
+              <w:jc w:val="center"/>
+            </w:pPr>
+            <w:r/>
+            <w:r>
+              <w:rPr>
+                <w:b/>
+                <w:sz w:val="16"/>
+              </w:rPr>
+              <w:t>FRONT | T5 Flash Cards - Regulation Sources and Blending | Card 14</w:t>
+            </w:r>
+          </w:p>
+          <w:p>
+            <w:pPr>
+              <w:spacing w:before="0" w:after="0" w:line="240" w:lineRule="auto"/>
+              <w:jc w:val="center"/>
+            </w:pPr>
+            <w:r>
+              <w:rPr>
+                <w:b w:val="0"/>
+                <w:sz w:val="16"/>
+              </w:rPr>
+            </w:r>
+          </w:p>
+          <w:p>
+            <w:pPr>
+              <w:spacing w:before="0" w:after="0" w:line="240" w:lineRule="auto"/>
+              <w:jc w:val="center"/>
+            </w:pPr>
+            <w:r>
+              <w:rPr>
+                <w:b w:val="0"/>
+                <w:sz w:val="16"/>
+              </w:rPr>
+              <w:t>Before changing source-water blend ratios for compliance, what should be checked?</w:t>
+            </w:r>
+          </w:p>
+        </w:tc>
+        <w:tc>
+          <w:tcPr>
+            <w:tcW w:type="dxa" w:w="7488"/>
+            <w:tcBorders>
+              <w:top w:val="single" w:sz="6" w:space="0" w:color="999999"/>
+              <w:left w:val="single" w:sz="6" w:space="0" w:color="999999"/>
+              <w:bottom w:val="single" w:sz="6" w:space="0" w:color="999999"/>
+              <w:right w:val="single" w:sz="6" w:space="0" w:color="999999"/>
+            </w:tcBorders>
+            <w:shd w:fill="FFFFFF"/>
+            <w:vAlign w:val="center"/>
+          </w:tcPr>
+          <w:p>
+            <w:pPr>
+              <w:spacing w:before="0" w:after="0" w:line="240" w:lineRule="auto"/>
+              <w:jc w:val="center"/>
+            </w:pPr>
+            <w:r/>
+            <w:r>
+              <w:rPr>
+                <w:b/>
+                <w:sz w:val="16"/>
+              </w:rPr>
+              <w:t>FRONT | T5 Flash Cards - Regulation Sources and Blending | Card 15</w:t>
+            </w:r>
+          </w:p>
+          <w:p>
+            <w:pPr>
+              <w:spacing w:before="0" w:after="0" w:line="240" w:lineRule="auto"/>
+              <w:jc w:val="center"/>
+            </w:pPr>
+            <w:r>
+              <w:rPr>
+                <w:b w:val="0"/>
+                <w:sz w:val="16"/>
+              </w:rPr>
+            </w:r>
+          </w:p>
+          <w:p>
+            <w:pPr>
+              <w:spacing w:before="0" w:after="0" w:line="240" w:lineRule="auto"/>
+              <w:jc w:val="center"/>
+            </w:pPr>
+            <w:r>
+              <w:rPr>
+                <w:b w:val="0"/>
+                <w:sz w:val="16"/>
+              </w:rPr>
+              <w:t>Why can a source blend that lowers nitrate still create an operational concern?</w:t>
+            </w:r>
+          </w:p>
+        </w:tc>
+      </w:tr>
+      <w:tr>
+        <w:trPr>
+          <w:trHeight w:val="2520" w:hRule="exact"/>
+        </w:trPr>
+        <w:tc>
+          <w:tcPr>
+            <w:tcW w:type="dxa" w:w="7488"/>
+            <w:tcBorders>
+              <w:top w:val="single" w:sz="6" w:space="0" w:color="999999"/>
+              <w:left w:val="single" w:sz="6" w:space="0" w:color="999999"/>
+              <w:bottom w:val="single" w:sz="6" w:space="0" w:color="999999"/>
+              <w:right w:val="single" w:sz="6" w:space="0" w:color="999999"/>
+            </w:tcBorders>
+            <w:shd w:fill="FFFFFF"/>
+            <w:vAlign w:val="center"/>
+          </w:tcPr>
+          <w:p>
+            <w:pPr>
+              <w:spacing w:before="0" w:after="0" w:line="240" w:lineRule="auto"/>
+              <w:jc w:val="center"/>
+            </w:pPr>
+            <w:r/>
+            <w:r>
+              <w:rPr>
+                <w:b/>
+                <w:sz w:val="16"/>
+              </w:rPr>
+              <w:t>FRONT | T5 Flash Cards - Regulation Sources and Blending | Card 16</w:t>
+            </w:r>
+          </w:p>
+          <w:p>
+            <w:pPr>
+              <w:spacing w:before="0" w:after="0" w:line="240" w:lineRule="auto"/>
+              <w:jc w:val="center"/>
+            </w:pPr>
+            <w:r>
+              <w:rPr>
+                <w:b w:val="0"/>
+                <w:sz w:val="16"/>
+              </w:rPr>
+            </w:r>
+          </w:p>
+          <w:p>
+            <w:pPr>
+              <w:spacing w:before="0" w:after="0" w:line="240" w:lineRule="auto"/>
+              <w:jc w:val="center"/>
+            </w:pPr>
+            <w:r>
+              <w:rPr>
+                <w:b w:val="0"/>
+                <w:sz w:val="16"/>
+              </w:rPr>
+              <w:t>If a source blend increases chlorine demand, what should the operator evaluate?</w:t>
+            </w:r>
+          </w:p>
+        </w:tc>
+        <w:tc>
+          <w:tcPr>
+            <w:tcW w:type="dxa" w:w="7488"/>
+            <w:tcBorders>
+              <w:top w:val="single" w:sz="6" w:space="0" w:color="999999"/>
+              <w:left w:val="single" w:sz="6" w:space="0" w:color="999999"/>
+              <w:bottom w:val="single" w:sz="6" w:space="0" w:color="999999"/>
+              <w:right w:val="single" w:sz="6" w:space="0" w:color="999999"/>
+            </w:tcBorders>
+            <w:shd w:fill="FFFFFF"/>
+            <w:vAlign w:val="center"/>
+          </w:tcPr>
+          <w:p>
+            <w:pPr>
+              <w:spacing w:before="0" w:after="0" w:line="240" w:lineRule="auto"/>
+              <w:jc w:val="center"/>
+            </w:pPr>
+            <w:r/>
+            <w:r>
+              <w:rPr>
+                <w:b/>
+                <w:sz w:val="16"/>
+              </w:rPr>
+              <w:t>FRONT | T5 Flash Cards - Regulation Sources and Blending | Card 17</w:t>
+            </w:r>
+          </w:p>
+          <w:p>
+            <w:pPr>
+              <w:spacing w:before="0" w:after="0" w:line="240" w:lineRule="auto"/>
+              <w:jc w:val="center"/>
+            </w:pPr>
+            <w:r>
+              <w:rPr>
+                <w:b w:val="0"/>
+                <w:sz w:val="16"/>
+              </w:rPr>
+            </w:r>
+          </w:p>
+          <w:p>
+            <w:pPr>
+              <w:spacing w:before="0" w:after="0" w:line="240" w:lineRule="auto"/>
+              <w:jc w:val="center"/>
+            </w:pPr>
+            <w:r>
+              <w:rPr>
+                <w:b w:val="0"/>
+                <w:sz w:val="16"/>
+              </w:rPr>
+              <w:t>What is the operator concern if filter turbidity rises after a source blend change?</w:t>
+            </w:r>
+          </w:p>
+        </w:tc>
+      </w:tr>
+      <w:tr>
+        <w:trPr>
+          <w:trHeight w:val="2520" w:hRule="exact"/>
+        </w:trPr>
+        <w:tc>
+          <w:tcPr>
+            <w:tcW w:type="dxa" w:w="7488"/>
+            <w:tcBorders>
+              <w:top w:val="single" w:sz="6" w:space="0" w:color="999999"/>
+              <w:left w:val="single" w:sz="6" w:space="0" w:color="999999"/>
+              <w:bottom w:val="single" w:sz="6" w:space="0" w:color="999999"/>
+              <w:right w:val="single" w:sz="6" w:space="0" w:color="999999"/>
+            </w:tcBorders>
+            <w:shd w:fill="FFFFFF"/>
+            <w:vAlign w:val="center"/>
+          </w:tcPr>
+          <w:p>
+            <w:pPr>
+              <w:spacing w:before="0" w:after="0" w:line="240" w:lineRule="auto"/>
+              <w:jc w:val="center"/>
+            </w:pPr>
+            <w:r/>
+            <w:r>
+              <w:rPr>
+                <w:b/>
+                <w:sz w:val="16"/>
+              </w:rPr>
+              <w:t>FRONT | T5 Flash Cards - Regulation Sources and Blending | Card 18</w:t>
+            </w:r>
+          </w:p>
+          <w:p>
+            <w:pPr>
+              <w:spacing w:before="0" w:after="0" w:line="240" w:lineRule="auto"/>
+              <w:jc w:val="center"/>
+            </w:pPr>
+            <w:r>
+              <w:rPr>
+                <w:b w:val="0"/>
+                <w:sz w:val="16"/>
+              </w:rPr>
+            </w:r>
+          </w:p>
+          <w:p>
+            <w:pPr>
+              <w:spacing w:before="0" w:after="0" w:line="240" w:lineRule="auto"/>
+              <w:jc w:val="center"/>
+            </w:pPr>
+            <w:r>
+              <w:rPr>
+                <w:b w:val="0"/>
+                <w:sz w:val="16"/>
+              </w:rPr>
+              <w:t>A confirmed E. coli positive routine sample is reported. What is the best operator response?</w:t>
+            </w:r>
+          </w:p>
+        </w:tc>
+        <w:tc>
+          <w:tcPr>
+            <w:tcW w:type="dxa" w:w="7488"/>
+            <w:tcBorders>
+              <w:top w:val="single" w:sz="6" w:space="0" w:color="999999"/>
+              <w:left w:val="single" w:sz="6" w:space="0" w:color="999999"/>
+              <w:bottom w:val="single" w:sz="6" w:space="0" w:color="999999"/>
+              <w:right w:val="single" w:sz="6" w:space="0" w:color="999999"/>
+            </w:tcBorders>
+            <w:shd w:fill="FFFFFF"/>
+            <w:vAlign w:val="center"/>
+          </w:tcPr>
+          <w:p>
+            <w:pPr>
+              <w:spacing w:before="0" w:after="0" w:line="240" w:lineRule="auto"/>
+              <w:jc w:val="center"/>
+            </w:pPr>
+            <w:r/>
+            <w:r>
+              <w:rPr>
+                <w:b/>
+                <w:sz w:val="16"/>
+              </w:rPr>
+              <w:t>FRONT | T5 Flash Cards - Regulation Sources and Blending | Card 19</w:t>
+            </w:r>
+          </w:p>
+          <w:p>
+            <w:pPr>
+              <w:spacing w:before="0" w:after="0" w:line="240" w:lineRule="auto"/>
+              <w:jc w:val="center"/>
+            </w:pPr>
+            <w:r>
+              <w:rPr>
+                <w:b w:val="0"/>
+                <w:sz w:val="16"/>
+              </w:rPr>
+            </w:r>
+          </w:p>
+          <w:p>
+            <w:pPr>
+              <w:spacing w:before="0" w:after="0" w:line="240" w:lineRule="auto"/>
+              <w:jc w:val="center"/>
+            </w:pPr>
+            <w:r>
+              <w:rPr>
+                <w:b w:val="0"/>
+                <w:sz w:val="16"/>
+              </w:rPr>
+              <w:t>What does a Tier 1 public notice generally indicate?</w:t>
+            </w:r>
+          </w:p>
+        </w:tc>
+      </w:tr>
+      <w:tr>
+        <w:trPr>
+          <w:trHeight w:val="2520" w:hRule="exact"/>
+        </w:trPr>
+        <w:tc>
+          <w:tcPr>
+            <w:tcW w:type="dxa" w:w="7488"/>
+            <w:tcBorders>
+              <w:top w:val="single" w:sz="6" w:space="0" w:color="999999"/>
+              <w:left w:val="single" w:sz="6" w:space="0" w:color="999999"/>
+              <w:bottom w:val="single" w:sz="6" w:space="0" w:color="999999"/>
+              <w:right w:val="single" w:sz="6" w:space="0" w:color="999999"/>
+            </w:tcBorders>
+            <w:shd w:fill="FFFFFF"/>
+            <w:vAlign w:val="center"/>
+          </w:tcPr>
+          <w:p>
+            <w:pPr>
+              <w:spacing w:before="0" w:after="0" w:line="240" w:lineRule="auto"/>
+              <w:jc w:val="center"/>
+            </w:pPr>
+            <w:r/>
+            <w:r>
+              <w:rPr>
+                <w:b/>
+                <w:sz w:val="16"/>
+              </w:rPr>
+              <w:t>FRONT | T5 Flash Cards - Regulation Sources and Blending | Card 20</w:t>
+            </w:r>
+          </w:p>
+          <w:p>
+            <w:pPr>
+              <w:spacing w:before="0" w:after="0" w:line="240" w:lineRule="auto"/>
+              <w:jc w:val="center"/>
+            </w:pPr>
+            <w:r>
+              <w:rPr>
+                <w:b w:val="0"/>
+                <w:sz w:val="16"/>
+              </w:rPr>
+            </w:r>
+          </w:p>
+          <w:p>
+            <w:pPr>
+              <w:spacing w:before="0" w:after="0" w:line="240" w:lineRule="auto"/>
+              <w:jc w:val="center"/>
+            </w:pPr>
+            <w:r>
+              <w:rPr>
+                <w:b w:val="0"/>
+                <w:sz w:val="16"/>
+              </w:rPr>
+              <w:t>A compliance sample was analyzed by a lab not accredited for the method. What is the concern?</w:t>
+            </w:r>
+          </w:p>
+        </w:tc>
+        <w:tc>
+          <w:tcPr>
+            <w:tcW w:type="dxa" w:w="7488"/>
+            <w:tcBorders>
+              <w:top w:val="single" w:sz="6" w:space="0" w:color="999999"/>
+              <w:left w:val="single" w:sz="6" w:space="0" w:color="999999"/>
+              <w:bottom w:val="single" w:sz="6" w:space="0" w:color="999999"/>
+              <w:right w:val="single" w:sz="6" w:space="0" w:color="999999"/>
+            </w:tcBorders>
+            <w:shd w:fill="FFFFFF"/>
+            <w:vAlign w:val="center"/>
+          </w:tcPr>
+          <w:p>
+            <w:pPr>
+              <w:spacing w:before="0" w:after="0" w:line="240" w:lineRule="auto"/>
+              <w:jc w:val="center"/>
+            </w:pPr>
+            <w:r/>
+            <w:r>
+              <w:rPr>
+                <w:b/>
+                <w:sz w:val="16"/>
+              </w:rPr>
+              <w:t>FRONT |  | Card 0</w:t>
+            </w:r>
+          </w:p>
+          <w:p>
+            <w:pPr>
+              <w:spacing w:before="0" w:after="0" w:line="240" w:lineRule="auto"/>
+              <w:jc w:val="center"/>
+            </w:pPr>
+            <w:r>
+              <w:rPr>
+                <w:b w:val="0"/>
+                <w:sz w:val="16"/>
+              </w:rPr>
+            </w:r>
+          </w:p>
+          <w:p>
+            <w:pPr>
+              <w:spacing w:before="0" w:after="0" w:line="240" w:lineRule="auto"/>
+              <w:jc w:val="center"/>
+            </w:pPr>
+            <w:r>
+              <w:rPr>
+                <w:b w:val="0"/>
+                <w:sz w:val="16"/>
+              </w:rPr>
+            </w:r>
+          </w:p>
+        </w:tc>
+      </w:tr>
+    </w:tbl>
+    <w:p>
+      <w:r>
+        <w:br w:type="page"/>
+      </w:r>
+    </w:p>
+    <w:tbl>
+      <w:tblPr>
+        <w:tblW w:type="auto" w:w="0"/>
+        <w:jc w:val="center"/>
+        <w:tblLayout w:type="fixed"/>
+        <w:tblLook w:firstColumn="1" w:firstRow="1" w:lastColumn="0" w:lastRow="0" w:noHBand="0" w:noVBand="1" w:val="04A0"/>
+      </w:tblPr>
+      <w:tblGrid>
+        <w:gridCol w:w="7560"/>
+        <w:gridCol w:w="7560"/>
+      </w:tblGrid>
+      <w:tr>
+        <w:trPr>
+          <w:trHeight w:val="2520" w:hRule="exact"/>
+        </w:trPr>
+        <w:tc>
+          <w:tcPr>
+            <w:tcW w:type="dxa" w:w="7488"/>
+            <w:tcBorders>
+              <w:top w:val="single" w:sz="6" w:space="0" w:color="999999"/>
+              <w:left w:val="single" w:sz="6" w:space="0" w:color="999999"/>
+              <w:bottom w:val="single" w:sz="6" w:space="0" w:color="999999"/>
+              <w:right w:val="single" w:sz="6" w:space="0" w:color="999999"/>
+            </w:tcBorders>
+            <w:shd w:fill="FFFFFF"/>
+            <w:vAlign w:val="center"/>
+          </w:tcPr>
+          <w:p>
+            <w:pPr>
+              <w:spacing w:before="0" w:after="0" w:line="240" w:lineRule="auto"/>
+              <w:jc w:val="center"/>
+            </w:pPr>
+            <w:r/>
+            <w:r>
+              <w:rPr>
+                <w:b/>
+                <w:sz w:val="16"/>
+              </w:rPr>
+              <w:t>BACK | Card 15</w:t>
+            </w:r>
+          </w:p>
+          <w:p>
+            <w:pPr>
+              <w:spacing w:before="0" w:after="0" w:line="240" w:lineRule="auto"/>
+              <w:jc w:val="center"/>
+            </w:pPr>
+            <w:r>
+              <w:rPr>
+                <w:b w:val="0"/>
+                <w:sz w:val="16"/>
+              </w:rPr>
+              <w:t>It may increase TDS, hardness, DBP formation potential, corrosion, taste/odor, or treatment demand.</w:t>
+            </w:r>
+          </w:p>
+          <w:p>
+            <w:pPr>
+              <w:spacing w:before="0" w:after="0" w:line="240" w:lineRule="auto"/>
+              <w:jc w:val="center"/>
+            </w:pPr>
+            <w:r>
+              <w:rPr>
+                <w:b w:val="0"/>
+                <w:sz w:val="16"/>
+              </w:rPr>
+            </w:r>
+          </w:p>
+          <w:p>
+            <w:pPr>
+              <w:spacing w:before="0" w:after="0" w:line="240" w:lineRule="auto"/>
+              <w:jc w:val="center"/>
+            </w:pPr>
+            <w:r>
+              <w:rPr>
+                <w:b w:val="0"/>
+                <w:sz w:val="16"/>
+              </w:rPr>
+              <w:t>Source: Deck: T5 Flash Cards - Regulation Sources and Blending</w:t>
+            </w:r>
+          </w:p>
+        </w:tc>
+        <w:tc>
+          <w:tcPr>
+            <w:tcW w:type="dxa" w:w="7488"/>
+            <w:tcBorders>
+              <w:top w:val="single" w:sz="6" w:space="0" w:color="999999"/>
+              <w:left w:val="single" w:sz="6" w:space="0" w:color="999999"/>
+              <w:bottom w:val="single" w:sz="6" w:space="0" w:color="999999"/>
+              <w:right w:val="single" w:sz="6" w:space="0" w:color="999999"/>
+            </w:tcBorders>
+            <w:shd w:fill="FFFFFF"/>
+            <w:vAlign w:val="center"/>
+          </w:tcPr>
+          <w:p>
+            <w:pPr>
+              <w:spacing w:before="0" w:after="0" w:line="240" w:lineRule="auto"/>
+              <w:jc w:val="center"/>
+            </w:pPr>
+            <w:r/>
+            <w:r>
+              <w:rPr>
+                <w:b/>
+                <w:sz w:val="16"/>
+              </w:rPr>
+              <w:t>BACK | Card 14</w:t>
+            </w:r>
+          </w:p>
+          <w:p>
+            <w:pPr>
+              <w:spacing w:before="0" w:after="0" w:line="240" w:lineRule="auto"/>
+              <w:jc w:val="center"/>
+            </w:pPr>
+            <w:r>
+              <w:rPr>
+                <w:b w:val="0"/>
+                <w:sz w:val="16"/>
+              </w:rPr>
+              <w:t>Permit/operational limits, expected blended quality, required monitoring, documentation, and supervisor/DDW coordination as applicable.</w:t>
+            </w:r>
+          </w:p>
+          <w:p>
+            <w:pPr>
+              <w:spacing w:before="0" w:after="0" w:line="240" w:lineRule="auto"/>
+              <w:jc w:val="center"/>
+            </w:pPr>
+            <w:r>
+              <w:rPr>
+                <w:b w:val="0"/>
+                <w:sz w:val="16"/>
+              </w:rPr>
+            </w:r>
+          </w:p>
+          <w:p>
+            <w:pPr>
+              <w:spacing w:before="0" w:after="0" w:line="240" w:lineRule="auto"/>
+              <w:jc w:val="center"/>
+            </w:pPr>
+            <w:r>
+              <w:rPr>
+                <w:b w:val="0"/>
+                <w:sz w:val="16"/>
+              </w:rPr>
+              <w:t>Source: Deck: T5 Flash Cards - Regulation Sources and Blending</w:t>
+            </w:r>
+          </w:p>
+        </w:tc>
+      </w:tr>
+      <w:tr>
+        <w:trPr>
+          <w:trHeight w:val="2520" w:hRule="exact"/>
+        </w:trPr>
+        <w:tc>
+          <w:tcPr>
+            <w:tcW w:type="dxa" w:w="7488"/>
+            <w:tcBorders>
+              <w:top w:val="single" w:sz="6" w:space="0" w:color="999999"/>
+              <w:left w:val="single" w:sz="6" w:space="0" w:color="999999"/>
+              <w:bottom w:val="single" w:sz="6" w:space="0" w:color="999999"/>
+              <w:right w:val="single" w:sz="6" w:space="0" w:color="999999"/>
+            </w:tcBorders>
+            <w:shd w:fill="FFFFFF"/>
+            <w:vAlign w:val="center"/>
+          </w:tcPr>
+          <w:p>
+            <w:pPr>
+              <w:spacing w:before="0" w:after="0" w:line="240" w:lineRule="auto"/>
+              <w:jc w:val="center"/>
+            </w:pPr>
+            <w:r/>
+            <w:r>
+              <w:rPr>
+                <w:b/>
+                <w:sz w:val="16"/>
+              </w:rPr>
+              <w:t>BACK | Card 17</w:t>
+            </w:r>
+          </w:p>
+          <w:p>
+            <w:pPr>
+              <w:spacing w:before="0" w:after="0" w:line="240" w:lineRule="auto"/>
+              <w:jc w:val="center"/>
+            </w:pPr>
+            <w:r>
+              <w:rPr>
+                <w:b w:val="0"/>
+                <w:sz w:val="16"/>
+              </w:rPr>
+              <w:t>Raw water quality and treatment demand may have changed; check coagulant dose, jar testing, filters, and monitoring requirements.</w:t>
+            </w:r>
+          </w:p>
+          <w:p>
+            <w:pPr>
+              <w:spacing w:before="0" w:after="0" w:line="240" w:lineRule="auto"/>
+              <w:jc w:val="center"/>
+            </w:pPr>
+            <w:r>
+              <w:rPr>
+                <w:b w:val="0"/>
+                <w:sz w:val="16"/>
+              </w:rPr>
+            </w:r>
+          </w:p>
+          <w:p>
+            <w:pPr>
+              <w:spacing w:before="0" w:after="0" w:line="240" w:lineRule="auto"/>
+              <w:jc w:val="center"/>
+            </w:pPr>
+            <w:r>
+              <w:rPr>
+                <w:b w:val="0"/>
+                <w:sz w:val="16"/>
+              </w:rPr>
+              <w:t>Source: Deck: T5 Flash Cards - Regulation Sources and Blending</w:t>
+            </w:r>
+          </w:p>
+        </w:tc>
+        <w:tc>
+          <w:tcPr>
+            <w:tcW w:type="dxa" w:w="7488"/>
+            <w:tcBorders>
+              <w:top w:val="single" w:sz="6" w:space="0" w:color="999999"/>
+              <w:left w:val="single" w:sz="6" w:space="0" w:color="999999"/>
+              <w:bottom w:val="single" w:sz="6" w:space="0" w:color="999999"/>
+              <w:right w:val="single" w:sz="6" w:space="0" w:color="999999"/>
+            </w:tcBorders>
+            <w:shd w:fill="FFFFFF"/>
+            <w:vAlign w:val="center"/>
+          </w:tcPr>
+          <w:p>
+            <w:pPr>
+              <w:spacing w:before="0" w:after="0" w:line="240" w:lineRule="auto"/>
+              <w:jc w:val="center"/>
+            </w:pPr>
+            <w:r/>
+            <w:r>
+              <w:rPr>
+                <w:b/>
+                <w:sz w:val="16"/>
+              </w:rPr>
+              <w:t>BACK | Card 16</w:t>
+            </w:r>
+          </w:p>
+          <w:p>
+            <w:pPr>
+              <w:spacing w:before="0" w:after="0" w:line="240" w:lineRule="auto"/>
+              <w:jc w:val="center"/>
+            </w:pPr>
+            <w:r>
+              <w:rPr>
+                <w:b w:val="0"/>
+                <w:sz w:val="16"/>
+              </w:rPr>
+              <w:t>Disinfectant dose, residual, contact time, affected water, DBP risk, and monitoring/reporting triggers.</w:t>
+            </w:r>
+          </w:p>
+          <w:p>
+            <w:pPr>
+              <w:spacing w:before="0" w:after="0" w:line="240" w:lineRule="auto"/>
+              <w:jc w:val="center"/>
+            </w:pPr>
+            <w:r>
+              <w:rPr>
+                <w:b w:val="0"/>
+                <w:sz w:val="16"/>
+              </w:rPr>
+            </w:r>
+          </w:p>
+          <w:p>
+            <w:pPr>
+              <w:spacing w:before="0" w:after="0" w:line="240" w:lineRule="auto"/>
+              <w:jc w:val="center"/>
+            </w:pPr>
+            <w:r>
+              <w:rPr>
+                <w:b w:val="0"/>
+                <w:sz w:val="16"/>
+              </w:rPr>
+              <w:t>Source: Deck: T5 Flash Cards - Regulation Sources and Blending</w:t>
+            </w:r>
+          </w:p>
+        </w:tc>
+      </w:tr>
+      <w:tr>
+        <w:trPr>
+          <w:trHeight w:val="2520" w:hRule="exact"/>
+        </w:trPr>
+        <w:tc>
+          <w:tcPr>
+            <w:tcW w:type="dxa" w:w="7488"/>
+            <w:tcBorders>
+              <w:top w:val="single" w:sz="6" w:space="0" w:color="999999"/>
+              <w:left w:val="single" w:sz="6" w:space="0" w:color="999999"/>
+              <w:bottom w:val="single" w:sz="6" w:space="0" w:color="999999"/>
+              <w:right w:val="single" w:sz="6" w:space="0" w:color="999999"/>
+            </w:tcBorders>
+            <w:shd w:fill="FFFFFF"/>
+            <w:vAlign w:val="center"/>
+          </w:tcPr>
+          <w:p>
+            <w:pPr>
+              <w:spacing w:before="0" w:after="0" w:line="240" w:lineRule="auto"/>
+              <w:jc w:val="center"/>
+            </w:pPr>
+            <w:r/>
+            <w:r>
+              <w:rPr>
+                <w:b/>
+                <w:sz w:val="16"/>
+              </w:rPr>
+              <w:t>BACK | Card 19</w:t>
+            </w:r>
+          </w:p>
+          <w:p>
+            <w:pPr>
+              <w:spacing w:before="0" w:after="0" w:line="240" w:lineRule="auto"/>
+              <w:jc w:val="center"/>
+            </w:pPr>
+            <w:r>
+              <w:rPr>
+                <w:b w:val="0"/>
+                <w:sz w:val="16"/>
+              </w:rPr>
+              <w:t>A situation with immediate potential health concern requiring rapid public notice.</w:t>
+            </w:r>
+          </w:p>
+          <w:p>
+            <w:pPr>
+              <w:spacing w:before="0" w:after="0" w:line="240" w:lineRule="auto"/>
+              <w:jc w:val="center"/>
+            </w:pPr>
+            <w:r>
+              <w:rPr>
+                <w:b w:val="0"/>
+                <w:sz w:val="16"/>
+              </w:rPr>
+            </w:r>
+          </w:p>
+          <w:p>
+            <w:pPr>
+              <w:spacing w:before="0" w:after="0" w:line="240" w:lineRule="auto"/>
+              <w:jc w:val="center"/>
+            </w:pPr>
+            <w:r>
+              <w:rPr>
+                <w:b w:val="0"/>
+                <w:sz w:val="16"/>
+              </w:rPr>
+              <w:t>Source: Deck: T5 Flash Cards - Regulation Sources and Blending</w:t>
+            </w:r>
+          </w:p>
+        </w:tc>
+        <w:tc>
+          <w:tcPr>
+            <w:tcW w:type="dxa" w:w="7488"/>
+            <w:tcBorders>
+              <w:top w:val="single" w:sz="6" w:space="0" w:color="999999"/>
+              <w:left w:val="single" w:sz="6" w:space="0" w:color="999999"/>
+              <w:bottom w:val="single" w:sz="6" w:space="0" w:color="999999"/>
+              <w:right w:val="single" w:sz="6" w:space="0" w:color="999999"/>
+            </w:tcBorders>
+            <w:shd w:fill="FFFFFF"/>
+            <w:vAlign w:val="center"/>
+          </w:tcPr>
+          <w:p>
+            <w:pPr>
+              <w:spacing w:before="0" w:after="0" w:line="240" w:lineRule="auto"/>
+              <w:jc w:val="center"/>
+            </w:pPr>
+            <w:r/>
+            <w:r>
+              <w:rPr>
+                <w:b/>
+                <w:sz w:val="16"/>
+              </w:rPr>
+              <w:t>BACK | Card 18</w:t>
+            </w:r>
+          </w:p>
+          <w:p>
+            <w:pPr>
+              <w:spacing w:before="0" w:after="0" w:line="240" w:lineRule="auto"/>
+              <w:jc w:val="center"/>
+            </w:pPr>
+            <w:r>
+              <w:rPr>
+                <w:b w:val="0"/>
+                <w:sz w:val="16"/>
+              </w:rPr>
+              <w:t>Follow the bacteriological rule response plan, notify required contacts, and coordinate repeat/corrective action requirements.</w:t>
+            </w:r>
+          </w:p>
+          <w:p>
+            <w:pPr>
+              <w:spacing w:before="0" w:after="0" w:line="240" w:lineRule="auto"/>
+              <w:jc w:val="center"/>
+            </w:pPr>
+            <w:r>
+              <w:rPr>
+                <w:b w:val="0"/>
+                <w:sz w:val="16"/>
+              </w:rPr>
+            </w:r>
+          </w:p>
+          <w:p>
+            <w:pPr>
+              <w:spacing w:before="0" w:after="0" w:line="240" w:lineRule="auto"/>
+              <w:jc w:val="center"/>
+            </w:pPr>
+            <w:r>
+              <w:rPr>
+                <w:b w:val="0"/>
+                <w:sz w:val="16"/>
+              </w:rPr>
+              <w:t>Source: Deck: T5 Flash Cards - Regulation Sources and Blending</w:t>
+            </w:r>
+          </w:p>
+        </w:tc>
+      </w:tr>
+      <w:tr>
+        <w:trPr>
+          <w:trHeight w:val="2520" w:hRule="exact"/>
+        </w:trPr>
+        <w:tc>
+          <w:tcPr>
+            <w:tcW w:type="dxa" w:w="7488"/>
+            <w:tcBorders>
+              <w:top w:val="single" w:sz="6" w:space="0" w:color="999999"/>
+              <w:left w:val="single" w:sz="6" w:space="0" w:color="999999"/>
+              <w:bottom w:val="single" w:sz="6" w:space="0" w:color="999999"/>
+              <w:right w:val="single" w:sz="6" w:space="0" w:color="999999"/>
+            </w:tcBorders>
+            <w:shd w:fill="FFFFFF"/>
+            <w:vAlign w:val="center"/>
+          </w:tcPr>
+          <w:p>
+            <w:pPr>
+              <w:spacing w:before="0" w:after="0" w:line="240" w:lineRule="auto"/>
+              <w:jc w:val="center"/>
+            </w:pPr>
+            <w:r/>
+            <w:r>
+              <w:rPr>
+                <w:b/>
+                <w:sz w:val="16"/>
+              </w:rPr>
               <w:t>BACK | Card 0</w:t>
             </w:r>
           </w:p>
@@ -22202,6 +24165,71 @@
                 <w:sz w:val="16"/>
               </w:rPr>
               <w:t xml:space="preserve">Source: </w:t>
+            </w:r>
+          </w:p>
+        </w:tc>
+        <w:tc>
+          <w:tcPr>
+            <w:tcW w:type="dxa" w:w="7488"/>
+            <w:tcBorders>
+              <w:top w:val="single" w:sz="6" w:space="0" w:color="999999"/>
+              <w:left w:val="single" w:sz="6" w:space="0" w:color="999999"/>
+              <w:bottom w:val="single" w:sz="6" w:space="0" w:color="999999"/>
+              <w:right w:val="single" w:sz="6" w:space="0" w:color="999999"/>
+            </w:tcBorders>
+            <w:shd w:fill="FFFFFF"/>
+            <w:vAlign w:val="center"/>
+          </w:tcPr>
+          <w:p>
+            <w:pPr>
+              <w:spacing w:before="0" w:after="0" w:line="240" w:lineRule="auto"/>
+              <w:jc w:val="center"/>
+            </w:pPr>
+            <w:r/>
+            <w:r>
+              <w:rPr>
+                <w:b/>
+                <w:sz w:val="16"/>
+              </w:rPr>
+              <w:t>BACK | Card 20</w:t>
+            </w:r>
+          </w:p>
+          <w:p>
+            <w:pPr>
+              <w:spacing w:before="0" w:after="0" w:line="240" w:lineRule="auto"/>
+              <w:jc w:val="center"/>
+            </w:pPr>
+            <w:r>
+              <w:rPr>
+                <w:b w:val="0"/>
+                <w:sz w:val="16"/>
+              </w:rPr>
+              <w:t>The result may not be acceptable for compliance reporting.</w:t>
+            </w:r>
+          </w:p>
+          <w:p>
+            <w:pPr>
+              <w:spacing w:before="0" w:after="0" w:line="240" w:lineRule="auto"/>
+              <w:jc w:val="center"/>
+            </w:pPr>
+            <w:r>
+              <w:rPr>
+                <w:b w:val="0"/>
+                <w:sz w:val="16"/>
+              </w:rPr>
+            </w:r>
+          </w:p>
+          <w:p>
+            <w:pPr>
+              <w:spacing w:before="0" w:after="0" w:line="240" w:lineRule="auto"/>
+              <w:jc w:val="center"/>
+            </w:pPr>
+            <w:r>
+              <w:rPr>
+                <w:b w:val="0"/>
+                <w:sz w:val="16"/>
+              </w:rPr>
+              <w:t>Source: Deck: T5 Flash Cards - Regulation Sources and Blending</w:t>
             </w:r>
           </w:p>
         </w:tc>

</xml_diff>